<commit_message>
Second review round + fabrication fix: Euronext application package
- Round 2 findings from CV Reviewer and Cover Letter Reviewer applied:
  cross-seniority phrasing, cover-letter CTA, sales/finance/ops mention,
  seniority-mismatch framing
- CORRECTION: struck an unsupported 'GDPR' compliance claim added in v1/v2
  that isn't in the source CV (only ISO 27001 + partial SOC2 documented for
  Opensee) -- fixed in cv-v1/v2, docx, outreach, interview-prep, and
  republished the Notion cheat sheet (old page archived, new one clean)
</commit_message>
<xml_diff>
--- a/applications/2026-08-27_Euronext_Project-Manager-Primary-Markets/cv-v2.docx
+++ b/applications/2026-08-27_Euronext_Project-Manager-Primary-Markets/cv-v2.docx
@@ -28,7 +28,7 @@
     </w:p>
     <w:p>
       <w:r>
-        <w:t>15+ years structuring and driving delivery of complex, cross-functional projects in financial services — steering committees, RFP/RFQ coordination, regulatory and compliance delivery (GDPR, ISO 27001, SOC 2), and consolidated reporting to CTO and senior stakeholder audiences across 5+ countries. Capital-markets domain experience spans post-trade, risk, portfolio-management platforms and, at Opensee, structuring product design — use cases, client journeys, and functional requirements — for a solution adjacent to issuer and investment-platform workflows. Currently applying the same delivery discipline as an independent Product &amp; Project Lead, including a full AI-assisted delivery from design to production in under two months.</w:t>
+        <w:t>15+ years structuring and driving delivery of complex, cross-functional projects in financial services — steering committees, RFP/RFQ coordination, regulatory and compliance delivery (ISO 27001, SOC 2), and consolidated reporting to CTO and senior stakeholder audiences from analyst to C-level across 5+ countries. Capital-markets domain experience spans post-trade, risk, portfolio-management platforms and, at Opensee, structuring product design — use cases, client journeys, and functional requirements — for a solution adjacent to issuer and investment-platform workflows. Currently applying the same delivery discipline as an independent Product &amp; Project Lead, including a full AI-assisted delivery from design to production in under two months.</w:t>
       </w:r>
     </w:p>
     <w:p>
@@ -316,7 +316,7 @@
         <w:pStyle w:val="ListBullet"/>
       </w:pPr>
       <w:r>
-        <w:t>Regulatory &amp; Compliance: GDPR, ISO 27001, SOC 2, vendor management, PRM-certified risk analysis (market, counterparty, operational)</w:t>
+        <w:t>Regulatory &amp; Compliance: ISO 27001, SOC 2, vendor management, PRM-certified risk analysis (market, counterparty, operational)</w:t>
       </w:r>
     </w:p>
     <w:p>

</xml_diff>